<commit_message>
docs(HCO v2): MOM policy fixes plus Records and SOPs package
</commit_message>
<xml_diff>
--- a/policies/build/chapters_v2/MOM/HCO_MOM_2_v2_REWRITE_DRAFT.docx
+++ b/policies/build/chapters_v2/MOM/HCO_MOM_2_v2_REWRITE_DRAFT.docx
@@ -1757,7 +1757,19 @@
         <w:pStyle w:val="ListNumber"/>
       </w:pPr>
       <w:r>
-        <w:t>National List of Essential Medicines (NLEM) 2022. Ministry of Health and Family Welfare, Government of India. Available via: https://mohfw.gov.in (search "NLEM 2022").</w:t>
+        <w:t xml:space="preserve">Ministry of Health and Family Welfare, Government of India. (2022). </w:t>
+      </w:r>
+      <w:hyperlink r:id="rId9">
+        <w:r>
+          <w:rPr>
+            <w:color w:val="0563C1"/>
+            <w:u w:val="single"/>
+          </w:rPr>
+          <w:t>https://main.mohfw.gov.in/newshighlights-104</w:t>
+        </w:r>
+      </w:hyperlink>
+      <w:r>
+        <w:t xml:space="preserve"> National List of Essential Medicines (NLEM) 2022.</w:t>
       </w:r>
     </w:p>
     <w:p>
@@ -1769,7 +1781,19 @@
         <w:pStyle w:val="ListNumber"/>
       </w:pPr>
       <w:r>
-        <w:t>World Health Organization. WHO Model List of Essential Medicines, 23rd list. Geneva: WHO; 2023. Available at: https://www.who.int/publications/i/item/WHO-MHP-HPS-EML-2023.02</w:t>
+        <w:t xml:space="preserve">World Health Organization. (2023). </w:t>
+      </w:r>
+      <w:hyperlink r:id="rId10">
+        <w:r>
+          <w:rPr>
+            <w:color w:val="0563C1"/>
+            <w:u w:val="single"/>
+          </w:rPr>
+          <w:t>https://www.who.int/publications/i/item/WHO-MHP-HPS-EML-2023.02</w:t>
+        </w:r>
+      </w:hyperlink>
+      <w:r>
+        <w:t xml:space="preserve"> WHO Model List of Essential Medicines, 23rd list.</w:t>
       </w:r>
     </w:p>
     <w:p>

</xml_diff>